<commit_message>
Regenerate PDF form templates from DOCX placeholders
Refresh classpath PDFs from docx_to_pdf_template; update act_of_work.docx template as needed for the pipeline.
</commit_message>
<xml_diff>
--- a/backend/src/main/resources/templates/documents/act_of_work.docx
+++ b/backend/src/main/resources/templates/documents/act_of_work.docx
@@ -5061,6 +5061,14 @@
                 <w:sz w:val="16"/>
               </w:rPr>
               <w:t>{{ total_price }}</w:t>
+            </w:r>
+            <w:r>
+              <w:rPr>
+                <w:rFonts w:ascii="Liberation Sans" w:hAnsi="Liberation Sans"/>
+                <w:sz w:val="16"/>
+                <w:lang w:val="en-US"/>
+              </w:rPr>
+              <w:t xml:space="preserve"> </w:t>
             </w:r>
             <w:r>
               <w:rPr>

</xml_diff>